<commit_message>
Sistema atualizado. Corrigido pequenos bugs
</commit_message>
<xml_diff>
--- a/templates/biomedicina/modelo_plano_biomedicina_automatizado.docx
+++ b/templates/biomedicina/modelo_plano_biomedicina_automatizado.docx
@@ -1529,21 +1529,19 @@
           <w:rFonts w:ascii="Times New Roman" w:eastAsia="Calibri" w:hAnsi="Times New Roman" w:cs="Times New Roman"/>
           <w:color w:val="000000"/>
         </w:rPr>
-        <w:t>{{</w:t>
-      </w:r>
-      <w:r>
-        <w:rPr>
-          <w:rFonts w:ascii="Times New Roman" w:eastAsia="Calibri" w:hAnsi="Times New Roman" w:cs="Times New Roman"/>
-          <w:color w:val="000000"/>
-        </w:rPr>
-        <w:t>CONSELHO_RT</w:t>
-      </w:r>
-      <w:r>
-        <w:rPr>
-          <w:rFonts w:ascii="Times New Roman" w:eastAsia="Calibri" w:hAnsi="Times New Roman" w:cs="Times New Roman"/>
-          <w:color w:val="000000"/>
-        </w:rPr>
-        <w:t>}}</w:t>
+        <w:t>{{NUMERO_CONSELHO_RT}}</w:t>
+      </w:r>
+      <w:r>
+        <w:rPr>
+          <w:rFonts w:ascii="Times New Roman" w:eastAsia="Calibri" w:hAnsi="Times New Roman" w:cs="Times New Roman"/>
+          <w:color w:val="000000"/>
+        </w:rPr>
+      </w:r>
+      <w:r>
+        <w:rPr>
+          <w:rFonts w:ascii="Times New Roman" w:eastAsia="Calibri" w:hAnsi="Times New Roman" w:cs="Times New Roman"/>
+          <w:color w:val="000000"/>
+        </w:rPr>
       </w:r>
     </w:p>
     <w:p>
@@ -2691,6 +2689,14 @@
                 <w:rFonts w:ascii="Times New Roman" w:eastAsia="Calibri" w:hAnsi="Times New Roman" w:cs="Times New Roman"/>
               </w:rPr>
             </w:pPr>
+            <w:r>
+              <w:rPr>
+                <w:rFonts w:ascii="Times New Roman" w:hAnsi="Times New Roman"/>
+                <w:b w:val="0"/>
+                <w:sz w:val="24"/>
+              </w:rPr>
+              <w:t>{{CARGA_ATV1}}</w:t>
+            </w:r>
           </w:p>
         </w:tc>
       </w:tr>
@@ -2804,6 +2810,14 @@
                 <w:rFonts w:ascii="Times New Roman" w:eastAsia="Calibri" w:hAnsi="Times New Roman" w:cs="Times New Roman"/>
               </w:rPr>
             </w:pPr>
+            <w:r>
+              <w:rPr>
+                <w:rFonts w:ascii="Times New Roman" w:hAnsi="Times New Roman"/>
+                <w:b w:val="0"/>
+                <w:sz w:val="24"/>
+              </w:rPr>
+              <w:t>{{CARGA_ATV2}}</w:t>
+            </w:r>
           </w:p>
         </w:tc>
       </w:tr>
@@ -2917,6 +2931,14 @@
                 <w:rFonts w:ascii="Times New Roman" w:eastAsia="Calibri" w:hAnsi="Times New Roman" w:cs="Times New Roman"/>
               </w:rPr>
             </w:pPr>
+            <w:r>
+              <w:rPr>
+                <w:rFonts w:ascii="Times New Roman" w:hAnsi="Times New Roman"/>
+                <w:b w:val="0"/>
+                <w:sz w:val="24"/>
+              </w:rPr>
+              <w:t>{{CARGA_ATV3}}</w:t>
+            </w:r>
           </w:p>
         </w:tc>
       </w:tr>
@@ -3030,6 +3052,14 @@
                 <w:rFonts w:ascii="Times New Roman" w:eastAsia="Calibri" w:hAnsi="Times New Roman" w:cs="Times New Roman"/>
               </w:rPr>
             </w:pPr>
+            <w:r>
+              <w:rPr>
+                <w:rFonts w:ascii="Times New Roman" w:hAnsi="Times New Roman"/>
+                <w:b w:val="0"/>
+                <w:sz w:val="24"/>
+              </w:rPr>
+              <w:t>{{CARGA_ATV4}}</w:t>
+            </w:r>
           </w:p>
         </w:tc>
       </w:tr>
@@ -3143,6 +3173,14 @@
                 <w:rFonts w:ascii="Times New Roman" w:eastAsia="Calibri" w:hAnsi="Times New Roman" w:cs="Times New Roman"/>
               </w:rPr>
             </w:pPr>
+            <w:r>
+              <w:rPr>
+                <w:rFonts w:ascii="Times New Roman" w:hAnsi="Times New Roman"/>
+                <w:b w:val="0"/>
+                <w:sz w:val="24"/>
+              </w:rPr>
+              <w:t>{{CARGA_ATV5}}</w:t>
+            </w:r>
           </w:p>
         </w:tc>
       </w:tr>
@@ -3264,6 +3302,14 @@
                 <w:rFonts w:ascii="Times New Roman" w:eastAsia="Calibri" w:hAnsi="Times New Roman" w:cs="Times New Roman"/>
               </w:rPr>
             </w:pPr>
+            <w:r>
+              <w:rPr>
+                <w:rFonts w:ascii="Times New Roman" w:hAnsi="Times New Roman"/>
+                <w:b w:val="0"/>
+                <w:sz w:val="24"/>
+              </w:rPr>
+              <w:t>{{CARGA_ATV6}}</w:t>
+            </w:r>
           </w:p>
         </w:tc>
       </w:tr>
@@ -3385,6 +3431,14 @@
                 <w:rFonts w:ascii="Times New Roman" w:eastAsia="Calibri" w:hAnsi="Times New Roman" w:cs="Times New Roman"/>
               </w:rPr>
             </w:pPr>
+            <w:r>
+              <w:rPr>
+                <w:rFonts w:ascii="Times New Roman" w:hAnsi="Times New Roman"/>
+                <w:b w:val="0"/>
+                <w:sz w:val="24"/>
+              </w:rPr>
+              <w:t>{{CARGA_ATV7}}</w:t>
+            </w:r>
           </w:p>
         </w:tc>
       </w:tr>
@@ -3506,6 +3560,14 @@
                 <w:rFonts w:ascii="Times New Roman" w:eastAsia="Calibri" w:hAnsi="Times New Roman" w:cs="Times New Roman"/>
               </w:rPr>
             </w:pPr>
+            <w:r>
+              <w:rPr>
+                <w:rFonts w:ascii="Times New Roman" w:hAnsi="Times New Roman"/>
+                <w:b w:val="0"/>
+                <w:sz w:val="24"/>
+              </w:rPr>
+              <w:t>{{CARGA_ATV8}}</w:t>
+            </w:r>
           </w:p>
         </w:tc>
       </w:tr>
@@ -3594,7 +3656,7 @@
               <w:rPr>
                 <w:rFonts w:ascii="Times New Roman" w:eastAsia="Calibri" w:hAnsi="Times New Roman" w:cs="Times New Roman"/>
               </w:rPr>
-              <w:t>320 horas</w:t>
+              <w:t>{{CARGA_HORARIA}}</w:t>
             </w:r>
           </w:p>
         </w:tc>
@@ -3810,19 +3872,17 @@
         <w:rPr>
           <w:rFonts w:ascii="Times New Roman" w:eastAsia="Calibri" w:hAnsi="Times New Roman" w:cs="Times New Roman"/>
         </w:rPr>
-        <w:t>{{</w:t>
-      </w:r>
-      <w:r>
-        <w:rPr>
-          <w:rFonts w:ascii="Times New Roman" w:eastAsia="Calibri" w:hAnsi="Times New Roman" w:cs="Times New Roman"/>
-        </w:rPr>
-        <w:t>CONSELHO_RT</w:t>
-      </w:r>
-      <w:r>
-        <w:rPr>
-          <w:rFonts w:ascii="Times New Roman" w:eastAsia="Calibri" w:hAnsi="Times New Roman" w:cs="Times New Roman"/>
-        </w:rPr>
-        <w:t>}}</w:t>
+        <w:t>{{NUMERO_CONSELHO_RT}}</w:t>
+      </w:r>
+      <w:r>
+        <w:rPr>
+          <w:rFonts w:ascii="Times New Roman" w:eastAsia="Calibri" w:hAnsi="Times New Roman" w:cs="Times New Roman"/>
+        </w:rPr>
+      </w:r>
+      <w:r>
+        <w:rPr>
+          <w:rFonts w:ascii="Times New Roman" w:eastAsia="Calibri" w:hAnsi="Times New Roman" w:cs="Times New Roman"/>
+        </w:rPr>
       </w:r>
     </w:p>
     <w:p>
@@ -4076,6 +4136,7 @@
     </w:p>
     <w:sectPr>
       <w:footerReference w:type="default" r:id="rId9"/>
+      <w:headerReference w:type="default" r:id="rId12"/>
       <w:pgSz w:w="11900" w:h="16840"/>
       <w:pgMar w:top="270" w:right="788" w:bottom="343" w:left="736" w:header="0" w:footer="57" w:gutter="0"/>
       <w:pgNumType w:start="1"/>
@@ -4199,6 +4260,16 @@
     </w:p>
   </w:footnote>
 </w:footnotes>
+</file>
+
+<file path=word/header1.xml><?xml version="1.0" encoding="utf-8"?>
+<w:hdr xmlns:m="http://schemas.openxmlformats.org/officeDocument/2006/math" xmlns:mc="http://schemas.openxmlformats.org/markup-compatibility/2006" xmlns:mo="http://schemas.microsoft.com/office/mac/office/2008/main" xmlns:mv="urn:schemas-microsoft-com:mac:vml" xmlns:o="urn:schemas-microsoft-com:office:office" xmlns:r="http://schemas.openxmlformats.org/officeDocument/2006/relationships" xmlns:v="urn:schemas-microsoft-com:vml" xmlns:w10="urn:schemas-microsoft-com:office:word" xmlns:w14="http://schemas.microsoft.com/office/word/2010/wordml" xmlns:w="http://schemas.openxmlformats.org/wordprocessingml/2006/main" xmlns:wne="http://schemas.microsoft.com/office/word/2006/wordml" xmlns:wp14="http://schemas.microsoft.com/office/word/2010/wordprocessingDrawing" xmlns:wp="http://schemas.openxmlformats.org/drawingml/2006/wordprocessingDrawing" xmlns:wpc="http://schemas.microsoft.com/office/word/2010/wordprocessingCanvas" xmlns:wpg="http://schemas.microsoft.com/office/word/2010/wordprocessingGroup" xmlns:wpi="http://schemas.microsoft.com/office/word/2010/wordprocessingInk" xmlns:wps="http://schemas.microsoft.com/office/word/2010/wordprocessingShape" mc:Ignorable="w14 wp14">
+  <w:p>
+    <w:pPr>
+      <w:pStyle w:val="Header"/>
+    </w:pPr>
+  </w:p>
+</w:hdr>
 </file>
 
 <file path=word/styles.xml><?xml version="1.0" encoding="utf-8"?>

</xml_diff>

<commit_message>
fix: O extrator não reconhecia mensagens com Campo: Valor. Isso foi corrigido. Também foi melhorado o formato dos templates e corridigo alguns placeholders
</commit_message>
<xml_diff>
--- a/templates/biomedicina/modelo_plano_biomedicina_automatizado.docx
+++ b/templates/biomedicina/modelo_plano_biomedicina_automatizado.docx
@@ -280,7 +280,16 @@
           <w:highlight w:val="white"/>
           <w:u w:val="single"/>
         </w:rPr>
-        <w:t>6.1</w:t>
+        <w:t>6.</w:t>
+      </w:r>
+      <w:r>
+        <w:rPr>
+          <w:rFonts w:ascii="Times New Roman" w:eastAsia="Calibri" w:hAnsi="Times New Roman" w:cs="Times New Roman"/>
+          <w:b/>
+          <w:bCs/>
+          <w:u w:val="single"/>
+        </w:rPr>
+        <w:t>2</w:t>
       </w:r>
     </w:p>
     <w:p>
@@ -337,46 +346,14 @@
           <w:bCs/>
           <w:highlight w:val="white"/>
         </w:rPr>
-        <w:t>:</w:t>
-      </w:r>
-      <w:r>
-        <w:rPr>
-          <w:rFonts w:ascii="Times New Roman" w:eastAsia="Calibri" w:hAnsi="Times New Roman" w:cs="Times New Roman"/>
-          <w:b/>
-          <w:bCs/>
+        <w:t xml:space="preserve">: </w:t>
+      </w:r>
+      <w:r>
+        <w:rPr>
+          <w:rFonts w:ascii="Times New Roman" w:eastAsia="Calibri" w:hAnsi="Times New Roman" w:cs="Times New Roman"/>
           <w:highlight w:val="white"/>
         </w:rPr>
-        <w:t xml:space="preserve"> </w:t>
-      </w:r>
-      <w:r>
-        <w:rPr>
-          <w:rFonts w:ascii="Times New Roman" w:eastAsia="Calibri" w:hAnsi="Times New Roman" w:cs="Times New Roman"/>
-          <w:highlight w:val="white"/>
-        </w:rPr>
-        <w:t>{{AREA</w:t>
-      </w:r>
-      <w:r>
-        <w:rPr>
-          <w:rFonts w:ascii="Times New Roman" w:eastAsia="Calibri" w:hAnsi="Times New Roman" w:cs="Times New Roman"/>
-          <w:highlight w:val="white"/>
-        </w:rPr>
-        <w:t>_</w:t>
-      </w:r>
-      <w:proofErr w:type="gramStart"/>
-      <w:r>
-        <w:rPr>
-          <w:rFonts w:ascii="Times New Roman" w:eastAsia="Calibri" w:hAnsi="Times New Roman" w:cs="Times New Roman"/>
-          <w:highlight w:val="white"/>
-        </w:rPr>
-        <w:t>ESTAGIO</w:t>
-      </w:r>
-      <w:proofErr w:type="gramEnd"/>
-      <w:r>
-        <w:rPr>
-          <w:rFonts w:ascii="Times New Roman" w:eastAsia="Calibri" w:hAnsi="Times New Roman" w:cs="Times New Roman"/>
-          <w:highlight w:val="white"/>
-        </w:rPr>
-        <w:t>}}</w:t>
+        <w:t>{{AREA_ESTAGIO}}</w:t>
       </w:r>
     </w:p>
     <w:p>
@@ -412,27 +389,7 @@
         <w:rPr>
           <w:rFonts w:ascii="Times New Roman" w:eastAsia="Calibri" w:hAnsi="Times New Roman" w:cs="Times New Roman"/>
         </w:rPr>
-        <w:t>{{MODULO</w:t>
-      </w:r>
-      <w:r>
-        <w:rPr>
-          <w:rFonts w:ascii="Times New Roman" w:eastAsia="Calibri" w:hAnsi="Times New Roman" w:cs="Times New Roman"/>
-        </w:rPr>
-        <w:t>_</w:t>
-      </w:r>
-      <w:proofErr w:type="gramStart"/>
-      <w:r>
-        <w:rPr>
-          <w:rFonts w:ascii="Times New Roman" w:eastAsia="Calibri" w:hAnsi="Times New Roman" w:cs="Times New Roman"/>
-        </w:rPr>
-        <w:t>ESTAGIO</w:t>
-      </w:r>
-      <w:proofErr w:type="gramEnd"/>
-      <w:r>
-        <w:rPr>
-          <w:rFonts w:ascii="Times New Roman" w:eastAsia="Calibri" w:hAnsi="Times New Roman" w:cs="Times New Roman"/>
-        </w:rPr>
-        <w:t>}}</w:t>
+        <w:t>{{MODULO_ESTAGIO}}</w:t>
       </w:r>
     </w:p>
     <w:p>
@@ -546,74 +503,24 @@
           <w:bCs/>
           <w:color w:val="000000"/>
         </w:rPr>
-        <w:t>Cumpriu</w:t>
-      </w:r>
-      <w:r>
-        <w:rPr>
-          <w:rFonts w:ascii="Times New Roman" w:eastAsia="Calibri" w:hAnsi="Times New Roman" w:cs="Times New Roman"/>
-          <w:b/>
-          <w:bCs/>
-          <w:color w:val="000000"/>
-        </w:rPr>
-        <w:t xml:space="preserve"> </w:t>
-      </w:r>
-      <w:r>
-        <w:rPr>
-          <w:rFonts w:ascii="Times New Roman" w:eastAsia="Calibri" w:hAnsi="Times New Roman" w:cs="Times New Roman"/>
-          <w:b/>
-          <w:bCs/>
-        </w:rPr>
-        <w:t>o</w:t>
-      </w:r>
-      <w:r>
-        <w:rPr>
-          <w:rFonts w:ascii="Times New Roman" w:eastAsia="Calibri" w:hAnsi="Times New Roman" w:cs="Times New Roman"/>
-          <w:b/>
-          <w:bCs/>
-        </w:rPr>
-        <w:t xml:space="preserve"> </w:t>
-      </w:r>
-      <w:r>
-        <w:rPr>
-          <w:rFonts w:ascii="Times New Roman" w:eastAsia="Calibri" w:hAnsi="Times New Roman" w:cs="Times New Roman"/>
-          <w:b/>
-          <w:bCs/>
-        </w:rPr>
-        <w:t>Estágio</w:t>
-      </w:r>
-      <w:r>
-        <w:rPr>
-          <w:rFonts w:ascii="Times New Roman" w:eastAsia="Calibri" w:hAnsi="Times New Roman" w:cs="Times New Roman"/>
-          <w:b/>
-          <w:bCs/>
-        </w:rPr>
-        <w:t xml:space="preserve"> </w:t>
-      </w:r>
-      <w:r>
-        <w:rPr>
-          <w:rFonts w:ascii="Times New Roman" w:eastAsia="Calibri" w:hAnsi="Times New Roman" w:cs="Times New Roman"/>
-          <w:b/>
-          <w:bCs/>
-        </w:rPr>
-        <w:t>Supervisionado</w:t>
-      </w:r>
-      <w:r>
-        <w:rPr>
-          <w:rFonts w:ascii="Times New Roman" w:eastAsia="Calibri" w:hAnsi="Times New Roman" w:cs="Times New Roman"/>
-          <w:b/>
-          <w:bCs/>
-          <w:color w:val="000000"/>
-        </w:rPr>
-        <w:t xml:space="preserve"> I:</w:t>
-      </w:r>
-      <w:r>
-        <w:rPr>
-          <w:rFonts w:ascii="Times New Roman" w:eastAsia="Calibri" w:hAnsi="Times New Roman" w:cs="Times New Roman"/>
-          <w:b/>
-          <w:bCs/>
-          <w:color w:val="000000"/>
-        </w:rPr>
-        <w:t xml:space="preserve"> </w:t>
+        <w:t xml:space="preserve">Cumpriu </w:t>
+      </w:r>
+      <w:r>
+        <w:rPr>
+          <w:rFonts w:ascii="Times New Roman" w:eastAsia="Calibri" w:hAnsi="Times New Roman" w:cs="Times New Roman"/>
+          <w:b/>
+          <w:bCs/>
+        </w:rPr>
+        <w:t>o Estágio Supervisionado</w:t>
+      </w:r>
+      <w:r>
+        <w:rPr>
+          <w:rFonts w:ascii="Times New Roman" w:eastAsia="Calibri" w:hAnsi="Times New Roman" w:cs="Times New Roman"/>
+          <w:b/>
+          <w:bCs/>
+          <w:color w:val="000000"/>
+        </w:rPr>
+        <w:t xml:space="preserve"> I: </w:t>
       </w:r>
       <w:r>
         <w:rPr>
@@ -637,15 +544,7 @@
           <w:bCs/>
         </w:rPr>
         <w:br/>
-        <w:t>Cumpriu o Estágio Supervisionado II:</w:t>
-      </w:r>
-      <w:r>
-        <w:rPr>
-          <w:rFonts w:ascii="Times New Roman" w:eastAsia="Calibri" w:hAnsi="Times New Roman" w:cs="Times New Roman"/>
-          <w:b/>
-          <w:bCs/>
-        </w:rPr>
-        <w:t xml:space="preserve"> </w:t>
+        <w:t xml:space="preserve">Cumpriu o Estágio Supervisionado II: </w:t>
       </w:r>
       <w:r>
         <w:rPr>
@@ -779,15 +678,7 @@
           <w:rFonts w:ascii="Times New Roman" w:eastAsia="Calibri" w:hAnsi="Times New Roman" w:cs="Times New Roman"/>
           <w:color w:val="000000"/>
         </w:rPr>
-        <w:t>{{RA_ALUNO</w:t>
-      </w:r>
-      <w:proofErr w:type="gramStart"/>
-      <w:r>
-        <w:rPr>
-          <w:rFonts w:ascii="Times New Roman" w:eastAsia="Calibri" w:hAnsi="Times New Roman" w:cs="Times New Roman"/>
-          <w:color w:val="000000"/>
-        </w:rPr>
-        <w:t>}}</w:t>
+        <w:t>{{RA_ALUNO}}</w:t>
       </w:r>
       <w:r>
         <w:rPr>
@@ -798,7 +689,6 @@
         </w:rPr>
         <w:t xml:space="preserve">   </w:t>
       </w:r>
-      <w:proofErr w:type="gramEnd"/>
       <w:r>
         <w:rPr>
           <w:rFonts w:ascii="Times New Roman" w:eastAsia="Calibri" w:hAnsi="Times New Roman" w:cs="Times New Roman"/>
@@ -812,27 +702,7 @@
         <w:rPr>
           <w:rFonts w:ascii="Times New Roman" w:eastAsia="Calibri" w:hAnsi="Times New Roman" w:cs="Times New Roman"/>
         </w:rPr>
-        <w:t>{{CAMPUS</w:t>
-      </w:r>
-      <w:proofErr w:type="gramStart"/>
-      <w:r>
-        <w:rPr>
-          <w:rFonts w:ascii="Times New Roman" w:eastAsia="Calibri" w:hAnsi="Times New Roman" w:cs="Times New Roman"/>
-        </w:rPr>
-        <w:t>}}</w:t>
-      </w:r>
-      <w:r>
-        <w:rPr>
-          <w:rFonts w:ascii="Times New Roman" w:eastAsia="Calibri" w:hAnsi="Times New Roman" w:cs="Times New Roman"/>
-        </w:rPr>
-        <w:t xml:space="preserve">   </w:t>
-      </w:r>
-      <w:proofErr w:type="gramEnd"/>
-      <w:r>
-        <w:rPr>
-          <w:rFonts w:ascii="Times New Roman" w:eastAsia="Calibri" w:hAnsi="Times New Roman" w:cs="Times New Roman"/>
-        </w:rPr>
-        <w:t xml:space="preserve"> </w:t>
+        <w:t xml:space="preserve">{{CAMPUS}}    </w:t>
       </w:r>
       <w:r>
         <w:rPr>
@@ -882,14 +752,7 @@
           <w:rFonts w:ascii="Times New Roman" w:eastAsia="Calibri" w:hAnsi="Times New Roman" w:cs="Times New Roman"/>
           <w:color w:val="000000"/>
         </w:rPr>
-        <w:t xml:space="preserve"> </w:t>
-      </w:r>
-      <w:r>
-        <w:rPr>
-          <w:rFonts w:ascii="Times New Roman" w:eastAsia="Calibri" w:hAnsi="Times New Roman" w:cs="Times New Roman"/>
-          <w:color w:val="000000"/>
-        </w:rPr>
-        <w:t>{{PERIODO}}</w:t>
+        <w:t xml:space="preserve"> {{PERIODO}}</w:t>
       </w:r>
     </w:p>
     <w:p>
@@ -916,16 +779,7 @@
           <w:bCs/>
           <w:color w:val="000000"/>
         </w:rPr>
-        <w:t>Endereço residencial:</w:t>
-      </w:r>
-      <w:r>
-        <w:rPr>
-          <w:rFonts w:ascii="Times New Roman" w:eastAsia="Calibri" w:hAnsi="Times New Roman" w:cs="Times New Roman"/>
-          <w:b/>
-          <w:bCs/>
-          <w:color w:val="000000"/>
-        </w:rPr>
-        <w:t xml:space="preserve"> </w:t>
+        <w:t xml:space="preserve">Endereço residencial: </w:t>
       </w:r>
       <w:r>
         <w:rPr>
@@ -958,15 +812,7 @@
           <w:b/>
           <w:bCs/>
         </w:rPr>
-        <w:t>Bairro:</w:t>
-      </w:r>
-      <w:r>
-        <w:rPr>
-          <w:rFonts w:ascii="Times New Roman" w:eastAsia="Calibri" w:hAnsi="Times New Roman" w:cs="Times New Roman"/>
-          <w:b/>
-          <w:bCs/>
-        </w:rPr>
-        <w:t xml:space="preserve"> </w:t>
+        <w:t xml:space="preserve">Bairro: </w:t>
       </w:r>
       <w:r>
         <w:rPr>
@@ -1004,31 +850,15 @@
         <w:rPr>
           <w:rFonts w:ascii="Times New Roman" w:eastAsia="Calibri" w:hAnsi="Times New Roman" w:cs="Times New Roman"/>
         </w:rPr>
-        <w:t>{{CIDADE_ALUNO</w:t>
-      </w:r>
-      <w:proofErr w:type="gramStart"/>
-      <w:r>
-        <w:rPr>
-          <w:rFonts w:ascii="Times New Roman" w:eastAsia="Calibri" w:hAnsi="Times New Roman" w:cs="Times New Roman"/>
-        </w:rPr>
-        <w:t>}}</w:t>
-      </w:r>
-      <w:r>
-        <w:rPr>
-          <w:rFonts w:ascii="Times New Roman" w:eastAsia="Calibri" w:hAnsi="Times New Roman" w:cs="Times New Roman"/>
-          <w:b/>
-          <w:bCs/>
-        </w:rPr>
-        <w:t xml:space="preserve">   </w:t>
-      </w:r>
-      <w:proofErr w:type="gramEnd"/>
-      <w:r>
-        <w:rPr>
-          <w:rFonts w:ascii="Times New Roman" w:eastAsia="Calibri" w:hAnsi="Times New Roman" w:cs="Times New Roman"/>
-          <w:b/>
-          <w:bCs/>
-        </w:rPr>
-        <w:t xml:space="preserve">Estado: </w:t>
+        <w:t>{{CIDADE_ALUNO}}</w:t>
+      </w:r>
+      <w:r>
+        <w:rPr>
+          <w:rFonts w:ascii="Times New Roman" w:eastAsia="Calibri" w:hAnsi="Times New Roman" w:cs="Times New Roman"/>
+          <w:b/>
+          <w:bCs/>
+        </w:rPr>
+        <w:t xml:space="preserve">   Estado: </w:t>
       </w:r>
       <w:r>
         <w:rPr>
@@ -1115,16 +945,7 @@
           <w:bCs/>
           <w:color w:val="000000"/>
         </w:rPr>
-        <w:t>E-mail:</w:t>
-      </w:r>
-      <w:r>
-        <w:rPr>
-          <w:rFonts w:ascii="Times New Roman" w:eastAsia="Calibri" w:hAnsi="Times New Roman" w:cs="Times New Roman"/>
-          <w:b/>
-          <w:bCs/>
-          <w:color w:val="000000"/>
-        </w:rPr>
-        <w:t xml:space="preserve"> </w:t>
+        <w:t xml:space="preserve">E-mail: </w:t>
       </w:r>
       <w:r>
         <w:rPr>
@@ -1216,16 +1037,7 @@
           <w:bCs/>
           <w:color w:val="000000"/>
         </w:rPr>
-        <w:t>Nome Fantasia:</w:t>
-      </w:r>
-      <w:r>
-        <w:rPr>
-          <w:rFonts w:ascii="Times New Roman" w:eastAsia="Calibri" w:hAnsi="Times New Roman" w:cs="Times New Roman"/>
-          <w:b/>
-          <w:bCs/>
-          <w:color w:val="000000"/>
-        </w:rPr>
-        <w:t xml:space="preserve"> </w:t>
+        <w:t xml:space="preserve">Nome Fantasia: </w:t>
       </w:r>
       <w:r>
         <w:rPr>
@@ -1300,27 +1112,7 @@
         <w:rPr>
           <w:rFonts w:ascii="Times New Roman" w:eastAsia="Calibri" w:hAnsi="Times New Roman" w:cs="Times New Roman"/>
         </w:rPr>
-        <w:t>{{CNPJ</w:t>
-      </w:r>
-      <w:proofErr w:type="gramStart"/>
-      <w:r>
-        <w:rPr>
-          <w:rFonts w:ascii="Times New Roman" w:eastAsia="Calibri" w:hAnsi="Times New Roman" w:cs="Times New Roman"/>
-        </w:rPr>
-        <w:t>}}</w:t>
-      </w:r>
-      <w:r>
-        <w:rPr>
-          <w:rFonts w:ascii="Times New Roman" w:eastAsia="Calibri" w:hAnsi="Times New Roman" w:cs="Times New Roman"/>
-        </w:rPr>
-        <w:t xml:space="preserve">   </w:t>
-      </w:r>
-      <w:proofErr w:type="gramEnd"/>
-      <w:r>
-        <w:rPr>
-          <w:rFonts w:ascii="Times New Roman" w:eastAsia="Calibri" w:hAnsi="Times New Roman" w:cs="Times New Roman"/>
-        </w:rPr>
-        <w:t xml:space="preserve">  </w:t>
+        <w:t xml:space="preserve">{{CNPJ}}     </w:t>
       </w:r>
       <w:r>
         <w:rPr>
@@ -1417,31 +1209,15 @@
         <w:rPr>
           <w:rFonts w:ascii="Times New Roman" w:eastAsia="Calibri" w:hAnsi="Times New Roman" w:cs="Times New Roman"/>
         </w:rPr>
-        <w:t>{{CIDADE_EMPRESA</w:t>
-      </w:r>
-      <w:proofErr w:type="gramStart"/>
-      <w:r>
-        <w:rPr>
-          <w:rFonts w:ascii="Times New Roman" w:eastAsia="Calibri" w:hAnsi="Times New Roman" w:cs="Times New Roman"/>
-        </w:rPr>
-        <w:t>}}</w:t>
-      </w:r>
-      <w:r>
-        <w:rPr>
-          <w:rFonts w:ascii="Times New Roman" w:eastAsia="Calibri" w:hAnsi="Times New Roman" w:cs="Times New Roman"/>
-          <w:b/>
-          <w:bCs/>
-        </w:rPr>
-        <w:t xml:space="preserve">   </w:t>
-      </w:r>
-      <w:proofErr w:type="gramEnd"/>
-      <w:r>
-        <w:rPr>
-          <w:rFonts w:ascii="Times New Roman" w:eastAsia="Calibri" w:hAnsi="Times New Roman" w:cs="Times New Roman"/>
-          <w:b/>
-          <w:bCs/>
-        </w:rPr>
-        <w:t xml:space="preserve">   </w:t>
+        <w:t>{{CIDADE_EMPRESA}}</w:t>
+      </w:r>
+      <w:r>
+        <w:rPr>
+          <w:rFonts w:ascii="Times New Roman" w:eastAsia="Calibri" w:hAnsi="Times New Roman" w:cs="Times New Roman"/>
+          <w:b/>
+          <w:bCs/>
+        </w:rPr>
+        <w:t xml:space="preserve">      </w:t>
       </w:r>
       <w:r>
         <w:rPr>
@@ -1531,18 +1307,6 @@
         </w:rPr>
         <w:t>{{NUMERO_CONSELHO_RT}}</w:t>
       </w:r>
-      <w:r>
-        <w:rPr>
-          <w:rFonts w:ascii="Times New Roman" w:eastAsia="Calibri" w:hAnsi="Times New Roman" w:cs="Times New Roman"/>
-          <w:color w:val="000000"/>
-        </w:rPr>
-      </w:r>
-      <w:r>
-        <w:rPr>
-          <w:rFonts w:ascii="Times New Roman" w:eastAsia="Calibri" w:hAnsi="Times New Roman" w:cs="Times New Roman"/>
-          <w:color w:val="000000"/>
-        </w:rPr>
-      </w:r>
     </w:p>
     <w:p>
       <w:pPr>
@@ -1604,43 +1368,15 @@
           <w:color w:val="000000"/>
           <w:lang w:val="en-US"/>
         </w:rPr>
-        <w:t xml:space="preserve">E-mail </w:t>
-      </w:r>
-      <w:proofErr w:type="gramStart"/>
-      <w:r>
-        <w:rPr>
-          <w:rFonts w:ascii="Times New Roman" w:eastAsia="Calibri" w:hAnsi="Times New Roman" w:cs="Times New Roman"/>
-          <w:b/>
-          <w:bCs/>
+        <w:t xml:space="preserve">E-mail RT: </w:t>
+      </w:r>
+      <w:r>
+        <w:rPr>
+          <w:rFonts w:ascii="Times New Roman" w:eastAsia="Calibri" w:hAnsi="Times New Roman" w:cs="Times New Roman"/>
           <w:color w:val="000000"/>
           <w:lang w:val="en-US"/>
         </w:rPr>
-        <w:t xml:space="preserve">RT: </w:t>
-      </w:r>
-      <w:r>
-        <w:rPr>
-          <w:rFonts w:ascii="Times New Roman" w:eastAsia="Calibri" w:hAnsi="Times New Roman" w:cs="Times New Roman"/>
-          <w:color w:val="000000"/>
-          <w:lang w:val="en-US"/>
-        </w:rPr>
-        <w:t>{{</w:t>
-      </w:r>
-      <w:proofErr w:type="gramEnd"/>
-      <w:r>
-        <w:rPr>
-          <w:rFonts w:ascii="Times New Roman" w:eastAsia="Calibri" w:hAnsi="Times New Roman" w:cs="Times New Roman"/>
-          <w:color w:val="000000"/>
-          <w:lang w:val="en-US"/>
-        </w:rPr>
-        <w:t>EMAIL_RT}</w:t>
-      </w:r>
-      <w:r>
-        <w:rPr>
-          <w:rFonts w:ascii="Times New Roman" w:eastAsia="Calibri" w:hAnsi="Times New Roman" w:cs="Times New Roman"/>
-          <w:color w:val="000000"/>
-          <w:lang w:val="en-US"/>
-        </w:rPr>
-        <w:t>}</w:t>
+        <w:t>{{EMAIL_RT}}</w:t>
       </w:r>
     </w:p>
     <w:p>
@@ -2046,35 +1782,7 @@
               <w:rPr>
                 <w:rFonts w:ascii="Times New Roman" w:eastAsia="Calibri" w:hAnsi="Times New Roman" w:cs="Times New Roman"/>
               </w:rPr>
-              <w:t>{{DATA_</w:t>
-            </w:r>
-            <w:proofErr w:type="gramStart"/>
-            <w:r>
-              <w:rPr>
-                <w:rFonts w:ascii="Times New Roman" w:eastAsia="Calibri" w:hAnsi="Times New Roman" w:cs="Times New Roman"/>
-              </w:rPr>
-              <w:t>INICIO</w:t>
-            </w:r>
-            <w:proofErr w:type="gramEnd"/>
-            <w:r>
-              <w:rPr>
-                <w:rFonts w:ascii="Times New Roman" w:eastAsia="Calibri" w:hAnsi="Times New Roman" w:cs="Times New Roman"/>
-              </w:rPr>
-              <w:t>_</w:t>
-            </w:r>
-            <w:proofErr w:type="gramStart"/>
-            <w:r>
-              <w:rPr>
-                <w:rFonts w:ascii="Times New Roman" w:eastAsia="Calibri" w:hAnsi="Times New Roman" w:cs="Times New Roman"/>
-              </w:rPr>
-              <w:t>ESTAGIO</w:t>
-            </w:r>
-            <w:proofErr w:type="gramEnd"/>
-            <w:r>
-              <w:rPr>
-                <w:rFonts w:ascii="Times New Roman" w:eastAsia="Calibri" w:hAnsi="Times New Roman" w:cs="Times New Roman"/>
-              </w:rPr>
-              <w:t>}}</w:t>
+              <w:t>{{DATA_INICIO_ESTAGIO}}</w:t>
             </w:r>
           </w:p>
         </w:tc>
@@ -2119,27 +1827,7 @@
               <w:rPr>
                 <w:rFonts w:ascii="Times New Roman" w:eastAsia="Calibri" w:hAnsi="Times New Roman" w:cs="Times New Roman"/>
               </w:rPr>
-              <w:t>{{DATA_FIM</w:t>
-            </w:r>
-            <w:r>
-              <w:rPr>
-                <w:rFonts w:ascii="Times New Roman" w:eastAsia="Calibri" w:hAnsi="Times New Roman" w:cs="Times New Roman"/>
-              </w:rPr>
-              <w:t>_</w:t>
-            </w:r>
-            <w:proofErr w:type="gramStart"/>
-            <w:r>
-              <w:rPr>
-                <w:rFonts w:ascii="Times New Roman" w:eastAsia="Calibri" w:hAnsi="Times New Roman" w:cs="Times New Roman"/>
-              </w:rPr>
-              <w:t>ESTAGIO</w:t>
-            </w:r>
-            <w:proofErr w:type="gramEnd"/>
-            <w:r>
-              <w:rPr>
-                <w:rFonts w:ascii="Times New Roman" w:eastAsia="Calibri" w:hAnsi="Times New Roman" w:cs="Times New Roman"/>
-              </w:rPr>
-              <w:t>}}</w:t>
+              <w:t>{{DATA_FIM_ESTAGIO}}</w:t>
             </w:r>
           </w:p>
         </w:tc>
@@ -2190,19 +1878,7 @@
               <w:rPr>
                 <w:rFonts w:ascii="Times New Roman" w:eastAsia="Calibri" w:hAnsi="Times New Roman" w:cs="Times New Roman"/>
               </w:rPr>
-              <w:t xml:space="preserve">Segunda à </w:t>
-            </w:r>
-            <w:r>
-              <w:rPr>
-                <w:rFonts w:ascii="Times New Roman" w:eastAsia="Calibri" w:hAnsi="Times New Roman" w:cs="Times New Roman"/>
-              </w:rPr>
-              <w:t>S</w:t>
-            </w:r>
-            <w:r>
-              <w:rPr>
-                <w:rFonts w:ascii="Times New Roman" w:eastAsia="Calibri" w:hAnsi="Times New Roman" w:cs="Times New Roman"/>
-              </w:rPr>
-              <w:t>exta</w:t>
+              <w:t>Segunda à Sexta</w:t>
             </w:r>
           </w:p>
         </w:tc>
@@ -2298,31 +1974,7 @@
               <w:rPr>
                 <w:rFonts w:ascii="Times New Roman" w:eastAsia="Calibri" w:hAnsi="Times New Roman" w:cs="Times New Roman"/>
               </w:rPr>
-              <w:t>0</w:t>
-            </w:r>
-            <w:r>
-              <w:rPr>
-                <w:rFonts w:ascii="Times New Roman" w:eastAsia="Calibri" w:hAnsi="Times New Roman" w:cs="Times New Roman"/>
-              </w:rPr>
-              <w:t>8</w:t>
-            </w:r>
-            <w:r>
-              <w:rPr>
-                <w:rFonts w:ascii="Times New Roman" w:eastAsia="Calibri" w:hAnsi="Times New Roman" w:cs="Times New Roman"/>
-              </w:rPr>
-              <w:t>h00 às 1</w:t>
-            </w:r>
-            <w:r>
-              <w:rPr>
-                <w:rFonts w:ascii="Times New Roman" w:eastAsia="Calibri" w:hAnsi="Times New Roman" w:cs="Times New Roman"/>
-              </w:rPr>
-              <w:t>4</w:t>
-            </w:r>
-            <w:r>
-              <w:rPr>
-                <w:rFonts w:ascii="Times New Roman" w:eastAsia="Calibri" w:hAnsi="Times New Roman" w:cs="Times New Roman"/>
-              </w:rPr>
-              <w:t>h00</w:t>
+              <w:t>08h00 às 14h00</w:t>
             </w:r>
           </w:p>
         </w:tc>
@@ -2406,8 +2058,8 @@
         <w:tblLook w:val="0600" w:firstRow="0" w:lastRow="0" w:firstColumn="0" w:lastColumn="0" w:noHBand="1" w:noVBand="1"/>
       </w:tblPr>
       <w:tblGrid>
-        <w:gridCol w:w="420"/>
-        <w:gridCol w:w="6900"/>
+        <w:gridCol w:w="576"/>
+        <w:gridCol w:w="6744"/>
         <w:gridCol w:w="2880"/>
       </w:tblGrid>
       <w:tr>
@@ -2451,25 +2103,7 @@
                 <w:bCs/>
                 <w:color w:val="000000"/>
               </w:rPr>
-              <w:t xml:space="preserve">Atividades </w:t>
-            </w:r>
-            <w:r>
-              <w:rPr>
-                <w:rFonts w:ascii="Times New Roman" w:eastAsia="Calibri" w:hAnsi="Times New Roman" w:cs="Times New Roman"/>
-                <w:b/>
-                <w:bCs/>
-                <w:color w:val="000000"/>
-              </w:rPr>
-              <w:t>a</w:t>
-            </w:r>
-            <w:r>
-              <w:rPr>
-                <w:rFonts w:ascii="Times New Roman" w:eastAsia="Calibri" w:hAnsi="Times New Roman" w:cs="Times New Roman"/>
-                <w:b/>
-                <w:bCs/>
-                <w:color w:val="000000"/>
-              </w:rPr>
-              <w:t xml:space="preserve"> serem desenvolvidas  </w:t>
+              <w:t xml:space="preserve">Atividades a serem desenvolvidas  </w:t>
             </w:r>
           </w:p>
           <w:p>
@@ -2568,25 +2202,7 @@
                 <w:bCs/>
                 <w:color w:val="000000"/>
               </w:rPr>
-              <w:t xml:space="preserve">consumida </w:t>
-            </w:r>
-            <w:r>
-              <w:rPr>
-                <w:rFonts w:ascii="Times New Roman" w:eastAsia="Calibri" w:hAnsi="Times New Roman" w:cs="Times New Roman"/>
-                <w:b/>
-                <w:bCs/>
-                <w:color w:val="000000"/>
-              </w:rPr>
-              <w:t>para cada</w:t>
-            </w:r>
-            <w:r>
-              <w:rPr>
-                <w:rFonts w:ascii="Times New Roman" w:eastAsia="Calibri" w:hAnsi="Times New Roman" w:cs="Times New Roman"/>
-                <w:b/>
-                <w:bCs/>
-                <w:color w:val="000000"/>
-              </w:rPr>
-              <w:t xml:space="preserve"> atividade</w:t>
+              <w:t>consumida para cada atividade</w:t>
             </w:r>
           </w:p>
         </w:tc>
@@ -2597,7 +2213,7 @@
         </w:trPr>
         <w:tc>
           <w:tcPr>
-            <w:tcW w:w="420" w:type="dxa"/>
+            <w:tcW w:w="576" w:type="dxa"/>
             <w:tcMar>
               <w:top w:w="100" w:type="dxa"/>
               <w:left w:w="100" w:type="dxa"/>
@@ -2627,13 +2243,13 @@
                 <w:rFonts w:ascii="Times New Roman" w:eastAsia="Calibri" w:hAnsi="Times New Roman" w:cs="Times New Roman"/>
                 <w:color w:val="000000"/>
               </w:rPr>
-              <w:t xml:space="preserve">1- </w:t>
+              <w:t>1-</w:t>
             </w:r>
           </w:p>
         </w:tc>
         <w:tc>
           <w:tcPr>
-            <w:tcW w:w="6900" w:type="dxa"/>
+            <w:tcW w:w="6744" w:type="dxa"/>
             <w:tcMar>
               <w:top w:w="100" w:type="dxa"/>
               <w:left w:w="100" w:type="dxa"/>
@@ -2653,21 +2269,7 @@
               <w:rPr>
                 <w:rFonts w:ascii="Times New Roman" w:eastAsia="Calibri" w:hAnsi="Times New Roman" w:cs="Times New Roman"/>
               </w:rPr>
-              <w:t>{{</w:t>
-            </w:r>
-            <w:proofErr w:type="gramStart"/>
-            <w:r>
-              <w:rPr>
-                <w:rFonts w:ascii="Times New Roman" w:eastAsia="Calibri" w:hAnsi="Times New Roman" w:cs="Times New Roman"/>
-              </w:rPr>
-              <w:t>TITULO</w:t>
-            </w:r>
-            <w:proofErr w:type="gramEnd"/>
-            <w:r>
-              <w:rPr>
-                <w:rFonts w:ascii="Times New Roman" w:eastAsia="Calibri" w:hAnsi="Times New Roman" w:cs="Times New Roman"/>
-              </w:rPr>
-              <w:t>_ATV1}}</w:t>
+              <w:t>{{TITULO_ATV1}}</w:t>
             </w:r>
           </w:p>
         </w:tc>
@@ -2692,7 +2294,6 @@
             <w:r>
               <w:rPr>
                 <w:rFonts w:ascii="Times New Roman" w:hAnsi="Times New Roman"/>
-                <w:b w:val="0"/>
                 <w:sz w:val="24"/>
               </w:rPr>
               <w:t>{{CARGA_ATV1}}</w:t>
@@ -2706,7 +2307,7 @@
         </w:trPr>
         <w:tc>
           <w:tcPr>
-            <w:tcW w:w="420" w:type="dxa"/>
+            <w:tcW w:w="576" w:type="dxa"/>
             <w:tcMar>
               <w:top w:w="100" w:type="dxa"/>
               <w:left w:w="100" w:type="dxa"/>
@@ -2736,13 +2337,13 @@
                 <w:rFonts w:ascii="Times New Roman" w:eastAsia="Calibri" w:hAnsi="Times New Roman" w:cs="Times New Roman"/>
                 <w:color w:val="000000"/>
               </w:rPr>
-              <w:t xml:space="preserve">2- </w:t>
+              <w:t>2-</w:t>
             </w:r>
           </w:p>
         </w:tc>
         <w:tc>
           <w:tcPr>
-            <w:tcW w:w="6900" w:type="dxa"/>
+            <w:tcW w:w="6744" w:type="dxa"/>
             <w:tcMar>
               <w:top w:w="100" w:type="dxa"/>
               <w:left w:w="100" w:type="dxa"/>
@@ -2762,33 +2363,7 @@
               <w:rPr>
                 <w:rFonts w:ascii="Times New Roman" w:eastAsia="Calibri" w:hAnsi="Times New Roman" w:cs="Times New Roman"/>
               </w:rPr>
-              <w:t>{{</w:t>
-            </w:r>
-            <w:proofErr w:type="gramStart"/>
-            <w:r>
-              <w:rPr>
-                <w:rFonts w:ascii="Times New Roman" w:eastAsia="Calibri" w:hAnsi="Times New Roman" w:cs="Times New Roman"/>
-              </w:rPr>
-              <w:t>TITULO</w:t>
-            </w:r>
-            <w:proofErr w:type="gramEnd"/>
-            <w:r>
-              <w:rPr>
-                <w:rFonts w:ascii="Times New Roman" w:eastAsia="Calibri" w:hAnsi="Times New Roman" w:cs="Times New Roman"/>
-              </w:rPr>
-              <w:t>_ATV</w:t>
-            </w:r>
-            <w:r>
-              <w:rPr>
-                <w:rFonts w:ascii="Times New Roman" w:eastAsia="Calibri" w:hAnsi="Times New Roman" w:cs="Times New Roman"/>
-              </w:rPr>
-              <w:t>2</w:t>
-            </w:r>
-            <w:r>
-              <w:rPr>
-                <w:rFonts w:ascii="Times New Roman" w:eastAsia="Calibri" w:hAnsi="Times New Roman" w:cs="Times New Roman"/>
-              </w:rPr>
-              <w:t>}}</w:t>
+              <w:t>{{TITULO_ATV2}}</w:t>
             </w:r>
           </w:p>
         </w:tc>
@@ -2813,7 +2388,6 @@
             <w:r>
               <w:rPr>
                 <w:rFonts w:ascii="Times New Roman" w:hAnsi="Times New Roman"/>
-                <w:b w:val="0"/>
                 <w:sz w:val="24"/>
               </w:rPr>
               <w:t>{{CARGA_ATV2}}</w:t>
@@ -2827,7 +2401,7 @@
         </w:trPr>
         <w:tc>
           <w:tcPr>
-            <w:tcW w:w="420" w:type="dxa"/>
+            <w:tcW w:w="576" w:type="dxa"/>
             <w:tcMar>
               <w:top w:w="100" w:type="dxa"/>
               <w:left w:w="100" w:type="dxa"/>
@@ -2857,13 +2431,13 @@
                 <w:rFonts w:ascii="Times New Roman" w:eastAsia="Calibri" w:hAnsi="Times New Roman" w:cs="Times New Roman"/>
                 <w:color w:val="000000"/>
               </w:rPr>
-              <w:t xml:space="preserve">3- </w:t>
+              <w:t>3-</w:t>
             </w:r>
           </w:p>
         </w:tc>
         <w:tc>
           <w:tcPr>
-            <w:tcW w:w="6900" w:type="dxa"/>
+            <w:tcW w:w="6744" w:type="dxa"/>
             <w:tcMar>
               <w:top w:w="100" w:type="dxa"/>
               <w:left w:w="100" w:type="dxa"/>
@@ -2883,33 +2457,7 @@
               <w:rPr>
                 <w:rFonts w:ascii="Times New Roman" w:eastAsia="Calibri" w:hAnsi="Times New Roman" w:cs="Times New Roman"/>
               </w:rPr>
-              <w:t>{{</w:t>
-            </w:r>
-            <w:proofErr w:type="gramStart"/>
-            <w:r>
-              <w:rPr>
-                <w:rFonts w:ascii="Times New Roman" w:eastAsia="Calibri" w:hAnsi="Times New Roman" w:cs="Times New Roman"/>
-              </w:rPr>
-              <w:t>TITULO</w:t>
-            </w:r>
-            <w:proofErr w:type="gramEnd"/>
-            <w:r>
-              <w:rPr>
-                <w:rFonts w:ascii="Times New Roman" w:eastAsia="Calibri" w:hAnsi="Times New Roman" w:cs="Times New Roman"/>
-              </w:rPr>
-              <w:t>_ATV</w:t>
-            </w:r>
-            <w:r>
-              <w:rPr>
-                <w:rFonts w:ascii="Times New Roman" w:eastAsia="Calibri" w:hAnsi="Times New Roman" w:cs="Times New Roman"/>
-              </w:rPr>
-              <w:t>3</w:t>
-            </w:r>
-            <w:r>
-              <w:rPr>
-                <w:rFonts w:ascii="Times New Roman" w:eastAsia="Calibri" w:hAnsi="Times New Roman" w:cs="Times New Roman"/>
-              </w:rPr>
-              <w:t>}}</w:t>
+              <w:t>{{TITULO_ATV3}}</w:t>
             </w:r>
           </w:p>
         </w:tc>
@@ -2934,7 +2482,6 @@
             <w:r>
               <w:rPr>
                 <w:rFonts w:ascii="Times New Roman" w:hAnsi="Times New Roman"/>
-                <w:b w:val="0"/>
                 <w:sz w:val="24"/>
               </w:rPr>
               <w:t>{{CARGA_ATV3}}</w:t>
@@ -2948,7 +2495,7 @@
         </w:trPr>
         <w:tc>
           <w:tcPr>
-            <w:tcW w:w="420" w:type="dxa"/>
+            <w:tcW w:w="576" w:type="dxa"/>
             <w:tcMar>
               <w:top w:w="100" w:type="dxa"/>
               <w:left w:w="100" w:type="dxa"/>
@@ -2978,13 +2525,13 @@
                 <w:rFonts w:ascii="Times New Roman" w:eastAsia="Calibri" w:hAnsi="Times New Roman" w:cs="Times New Roman"/>
                 <w:color w:val="000000"/>
               </w:rPr>
-              <w:t xml:space="preserve">4- </w:t>
+              <w:t>4-</w:t>
             </w:r>
           </w:p>
         </w:tc>
         <w:tc>
           <w:tcPr>
-            <w:tcW w:w="6900" w:type="dxa"/>
+            <w:tcW w:w="6744" w:type="dxa"/>
             <w:tcMar>
               <w:top w:w="100" w:type="dxa"/>
               <w:left w:w="100" w:type="dxa"/>
@@ -3004,33 +2551,7 @@
               <w:rPr>
                 <w:rFonts w:ascii="Times New Roman" w:eastAsia="Calibri" w:hAnsi="Times New Roman" w:cs="Times New Roman"/>
               </w:rPr>
-              <w:t>{{</w:t>
-            </w:r>
-            <w:proofErr w:type="gramStart"/>
-            <w:r>
-              <w:rPr>
-                <w:rFonts w:ascii="Times New Roman" w:eastAsia="Calibri" w:hAnsi="Times New Roman" w:cs="Times New Roman"/>
-              </w:rPr>
-              <w:t>TITULO</w:t>
-            </w:r>
-            <w:proofErr w:type="gramEnd"/>
-            <w:r>
-              <w:rPr>
-                <w:rFonts w:ascii="Times New Roman" w:eastAsia="Calibri" w:hAnsi="Times New Roman" w:cs="Times New Roman"/>
-              </w:rPr>
-              <w:t>_ATV</w:t>
-            </w:r>
-            <w:r>
-              <w:rPr>
-                <w:rFonts w:ascii="Times New Roman" w:eastAsia="Calibri" w:hAnsi="Times New Roman" w:cs="Times New Roman"/>
-              </w:rPr>
-              <w:t>4</w:t>
-            </w:r>
-            <w:r>
-              <w:rPr>
-                <w:rFonts w:ascii="Times New Roman" w:eastAsia="Calibri" w:hAnsi="Times New Roman" w:cs="Times New Roman"/>
-              </w:rPr>
-              <w:t>}}</w:t>
+              <w:t>{{TITULO_ATV4}}</w:t>
             </w:r>
           </w:p>
         </w:tc>
@@ -3055,7 +2576,6 @@
             <w:r>
               <w:rPr>
                 <w:rFonts w:ascii="Times New Roman" w:hAnsi="Times New Roman"/>
-                <w:b w:val="0"/>
                 <w:sz w:val="24"/>
               </w:rPr>
               <w:t>{{CARGA_ATV4}}</w:t>
@@ -3069,7 +2589,7 @@
         </w:trPr>
         <w:tc>
           <w:tcPr>
-            <w:tcW w:w="420" w:type="dxa"/>
+            <w:tcW w:w="576" w:type="dxa"/>
             <w:tcMar>
               <w:top w:w="100" w:type="dxa"/>
               <w:left w:w="100" w:type="dxa"/>
@@ -3099,13 +2619,13 @@
                 <w:rFonts w:ascii="Times New Roman" w:eastAsia="Calibri" w:hAnsi="Times New Roman" w:cs="Times New Roman"/>
                 <w:color w:val="000000"/>
               </w:rPr>
-              <w:t xml:space="preserve">5- </w:t>
+              <w:t>5-</w:t>
             </w:r>
           </w:p>
         </w:tc>
         <w:tc>
           <w:tcPr>
-            <w:tcW w:w="6900" w:type="dxa"/>
+            <w:tcW w:w="6744" w:type="dxa"/>
             <w:tcMar>
               <w:top w:w="100" w:type="dxa"/>
               <w:left w:w="100" w:type="dxa"/>
@@ -3125,33 +2645,7 @@
               <w:rPr>
                 <w:rFonts w:ascii="Times New Roman" w:eastAsia="Calibri" w:hAnsi="Times New Roman" w:cs="Times New Roman"/>
               </w:rPr>
-              <w:t>{{</w:t>
-            </w:r>
-            <w:proofErr w:type="gramStart"/>
-            <w:r>
-              <w:rPr>
-                <w:rFonts w:ascii="Times New Roman" w:eastAsia="Calibri" w:hAnsi="Times New Roman" w:cs="Times New Roman"/>
-              </w:rPr>
-              <w:t>TITULO</w:t>
-            </w:r>
-            <w:proofErr w:type="gramEnd"/>
-            <w:r>
-              <w:rPr>
-                <w:rFonts w:ascii="Times New Roman" w:eastAsia="Calibri" w:hAnsi="Times New Roman" w:cs="Times New Roman"/>
-              </w:rPr>
-              <w:t>_ATV</w:t>
-            </w:r>
-            <w:r>
-              <w:rPr>
-                <w:rFonts w:ascii="Times New Roman" w:eastAsia="Calibri" w:hAnsi="Times New Roman" w:cs="Times New Roman"/>
-              </w:rPr>
-              <w:t>5</w:t>
-            </w:r>
-            <w:r>
-              <w:rPr>
-                <w:rFonts w:ascii="Times New Roman" w:eastAsia="Calibri" w:hAnsi="Times New Roman" w:cs="Times New Roman"/>
-              </w:rPr>
-              <w:t>}}</w:t>
+              <w:t>{{TITULO_ATV5}}</w:t>
             </w:r>
           </w:p>
         </w:tc>
@@ -3176,7 +2670,6 @@
             <w:r>
               <w:rPr>
                 <w:rFonts w:ascii="Times New Roman" w:hAnsi="Times New Roman"/>
-                <w:b w:val="0"/>
                 <w:sz w:val="24"/>
               </w:rPr>
               <w:t>{{CARGA_ATV5}}</w:t>
@@ -3190,7 +2683,7 @@
         </w:trPr>
         <w:tc>
           <w:tcPr>
-            <w:tcW w:w="420" w:type="dxa"/>
+            <w:tcW w:w="576" w:type="dxa"/>
             <w:tcMar>
               <w:top w:w="100" w:type="dxa"/>
               <w:left w:w="100" w:type="dxa"/>
@@ -3225,7 +2718,7 @@
         </w:tc>
         <w:tc>
           <w:tcPr>
-            <w:tcW w:w="6900" w:type="dxa"/>
+            <w:tcW w:w="6744" w:type="dxa"/>
             <w:tcMar>
               <w:top w:w="100" w:type="dxa"/>
               <w:left w:w="100" w:type="dxa"/>
@@ -3254,33 +2747,7 @@
               <w:rPr>
                 <w:rFonts w:ascii="Times New Roman" w:eastAsia="Calibri" w:hAnsi="Times New Roman" w:cs="Times New Roman"/>
               </w:rPr>
-              <w:t>{{</w:t>
-            </w:r>
-            <w:proofErr w:type="gramStart"/>
-            <w:r>
-              <w:rPr>
-                <w:rFonts w:ascii="Times New Roman" w:eastAsia="Calibri" w:hAnsi="Times New Roman" w:cs="Times New Roman"/>
-              </w:rPr>
-              <w:t>TITULO</w:t>
-            </w:r>
-            <w:proofErr w:type="gramEnd"/>
-            <w:r>
-              <w:rPr>
-                <w:rFonts w:ascii="Times New Roman" w:eastAsia="Calibri" w:hAnsi="Times New Roman" w:cs="Times New Roman"/>
-              </w:rPr>
-              <w:t>_ATV</w:t>
-            </w:r>
-            <w:r>
-              <w:rPr>
-                <w:rFonts w:ascii="Times New Roman" w:eastAsia="Calibri" w:hAnsi="Times New Roman" w:cs="Times New Roman"/>
-              </w:rPr>
-              <w:t>6</w:t>
-            </w:r>
-            <w:r>
-              <w:rPr>
-                <w:rFonts w:ascii="Times New Roman" w:eastAsia="Calibri" w:hAnsi="Times New Roman" w:cs="Times New Roman"/>
-              </w:rPr>
-              <w:t>}}</w:t>
+              <w:t>{{TITULO_ATV6}}</w:t>
             </w:r>
           </w:p>
         </w:tc>
@@ -3305,7 +2772,6 @@
             <w:r>
               <w:rPr>
                 <w:rFonts w:ascii="Times New Roman" w:hAnsi="Times New Roman"/>
-                <w:b w:val="0"/>
                 <w:sz w:val="24"/>
               </w:rPr>
               <w:t>{{CARGA_ATV6}}</w:t>
@@ -3319,7 +2785,7 @@
         </w:trPr>
         <w:tc>
           <w:tcPr>
-            <w:tcW w:w="420" w:type="dxa"/>
+            <w:tcW w:w="576" w:type="dxa"/>
             <w:tcMar>
               <w:top w:w="100" w:type="dxa"/>
               <w:left w:w="100" w:type="dxa"/>
@@ -3354,7 +2820,7 @@
         </w:tc>
         <w:tc>
           <w:tcPr>
-            <w:tcW w:w="6900" w:type="dxa"/>
+            <w:tcW w:w="6744" w:type="dxa"/>
             <w:tcMar>
               <w:top w:w="100" w:type="dxa"/>
               <w:left w:w="100" w:type="dxa"/>
@@ -3383,33 +2849,7 @@
               <w:rPr>
                 <w:rFonts w:ascii="Times New Roman" w:eastAsia="Calibri" w:hAnsi="Times New Roman" w:cs="Times New Roman"/>
               </w:rPr>
-              <w:t>{{</w:t>
-            </w:r>
-            <w:proofErr w:type="gramStart"/>
-            <w:r>
-              <w:rPr>
-                <w:rFonts w:ascii="Times New Roman" w:eastAsia="Calibri" w:hAnsi="Times New Roman" w:cs="Times New Roman"/>
-              </w:rPr>
-              <w:t>TITULO</w:t>
-            </w:r>
-            <w:proofErr w:type="gramEnd"/>
-            <w:r>
-              <w:rPr>
-                <w:rFonts w:ascii="Times New Roman" w:eastAsia="Calibri" w:hAnsi="Times New Roman" w:cs="Times New Roman"/>
-              </w:rPr>
-              <w:t>_ATV</w:t>
-            </w:r>
-            <w:r>
-              <w:rPr>
-                <w:rFonts w:ascii="Times New Roman" w:eastAsia="Calibri" w:hAnsi="Times New Roman" w:cs="Times New Roman"/>
-              </w:rPr>
-              <w:t>7</w:t>
-            </w:r>
-            <w:r>
-              <w:rPr>
-                <w:rFonts w:ascii="Times New Roman" w:eastAsia="Calibri" w:hAnsi="Times New Roman" w:cs="Times New Roman"/>
-              </w:rPr>
-              <w:t>}}</w:t>
+              <w:t>{{TITULO_ATV7}}</w:t>
             </w:r>
           </w:p>
         </w:tc>
@@ -3434,7 +2874,6 @@
             <w:r>
               <w:rPr>
                 <w:rFonts w:ascii="Times New Roman" w:hAnsi="Times New Roman"/>
-                <w:b w:val="0"/>
                 <w:sz w:val="24"/>
               </w:rPr>
               <w:t>{{CARGA_ATV7}}</w:t>
@@ -3448,7 +2887,7 @@
         </w:trPr>
         <w:tc>
           <w:tcPr>
-            <w:tcW w:w="420" w:type="dxa"/>
+            <w:tcW w:w="576" w:type="dxa"/>
             <w:tcMar>
               <w:top w:w="100" w:type="dxa"/>
               <w:left w:w="100" w:type="dxa"/>
@@ -3483,7 +2922,7 @@
         </w:tc>
         <w:tc>
           <w:tcPr>
-            <w:tcW w:w="6900" w:type="dxa"/>
+            <w:tcW w:w="6744" w:type="dxa"/>
             <w:tcMar>
               <w:top w:w="100" w:type="dxa"/>
               <w:left w:w="100" w:type="dxa"/>
@@ -3512,33 +2951,7 @@
               <w:rPr>
                 <w:rFonts w:ascii="Times New Roman" w:eastAsia="Calibri" w:hAnsi="Times New Roman" w:cs="Times New Roman"/>
               </w:rPr>
-              <w:t>{{</w:t>
-            </w:r>
-            <w:proofErr w:type="gramStart"/>
-            <w:r>
-              <w:rPr>
-                <w:rFonts w:ascii="Times New Roman" w:eastAsia="Calibri" w:hAnsi="Times New Roman" w:cs="Times New Roman"/>
-              </w:rPr>
-              <w:t>TITULO</w:t>
-            </w:r>
-            <w:proofErr w:type="gramEnd"/>
-            <w:r>
-              <w:rPr>
-                <w:rFonts w:ascii="Times New Roman" w:eastAsia="Calibri" w:hAnsi="Times New Roman" w:cs="Times New Roman"/>
-              </w:rPr>
-              <w:t>_ATV</w:t>
-            </w:r>
-            <w:r>
-              <w:rPr>
-                <w:rFonts w:ascii="Times New Roman" w:eastAsia="Calibri" w:hAnsi="Times New Roman" w:cs="Times New Roman"/>
-              </w:rPr>
-              <w:t>8</w:t>
-            </w:r>
-            <w:r>
-              <w:rPr>
-                <w:rFonts w:ascii="Times New Roman" w:eastAsia="Calibri" w:hAnsi="Times New Roman" w:cs="Times New Roman"/>
-              </w:rPr>
-              <w:t>}}</w:t>
+              <w:t>{{TITULO_ATV8}}</w:t>
             </w:r>
           </w:p>
         </w:tc>
@@ -3563,10 +2976,213 @@
             <w:r>
               <w:rPr>
                 <w:rFonts w:ascii="Times New Roman" w:hAnsi="Times New Roman"/>
-                <w:b w:val="0"/>
                 <w:sz w:val="24"/>
               </w:rPr>
               <w:t>{{CARGA_ATV8}}</w:t>
+            </w:r>
+          </w:p>
+        </w:tc>
+      </w:tr>
+      <w:tr>
+        <w:trPr>
+          <w:trHeight w:val="412"/>
+        </w:trPr>
+        <w:tc>
+          <w:tcPr>
+            <w:tcW w:w="576" w:type="dxa"/>
+            <w:tcMar>
+              <w:top w:w="100" w:type="dxa"/>
+              <w:left w:w="100" w:type="dxa"/>
+              <w:bottom w:w="100" w:type="dxa"/>
+              <w:right w:w="100" w:type="dxa"/>
+            </w:tcMar>
+          </w:tcPr>
+          <w:p>
+            <w:pPr>
+              <w:widowControl w:val="0"/>
+              <w:pBdr>
+                <w:top w:val="nil"/>
+                <w:left w:val="nil"/>
+                <w:bottom w:val="nil"/>
+                <w:right w:val="nil"/>
+                <w:between w:val="nil"/>
+              </w:pBdr>
+              <w:spacing w:line="240" w:lineRule="auto"/>
+              <w:jc w:val="center"/>
+              <w:rPr>
+                <w:rFonts w:ascii="Times New Roman" w:eastAsia="Calibri" w:hAnsi="Times New Roman" w:cs="Times New Roman"/>
+                <w:color w:val="000000"/>
+              </w:rPr>
+            </w:pPr>
+            <w:r>
+              <w:rPr>
+                <w:rFonts w:ascii="Times New Roman" w:eastAsia="Calibri" w:hAnsi="Times New Roman" w:cs="Times New Roman"/>
+              </w:rPr>
+              <w:t>9-</w:t>
+            </w:r>
+          </w:p>
+        </w:tc>
+        <w:tc>
+          <w:tcPr>
+            <w:tcW w:w="6744" w:type="dxa"/>
+            <w:tcMar>
+              <w:top w:w="100" w:type="dxa"/>
+              <w:left w:w="100" w:type="dxa"/>
+              <w:bottom w:w="100" w:type="dxa"/>
+              <w:right w:w="100" w:type="dxa"/>
+            </w:tcMar>
+          </w:tcPr>
+          <w:p>
+            <w:pPr>
+              <w:widowControl w:val="0"/>
+              <w:pBdr>
+                <w:top w:val="nil"/>
+                <w:left w:val="nil"/>
+                <w:bottom w:val="nil"/>
+                <w:right w:val="nil"/>
+                <w:between w:val="nil"/>
+              </w:pBdr>
+              <w:spacing w:line="240" w:lineRule="auto"/>
+              <w:ind w:left="62"/>
+              <w:jc w:val="center"/>
+              <w:rPr>
+                <w:rFonts w:ascii="Times New Roman" w:eastAsia="Calibri" w:hAnsi="Times New Roman" w:cs="Times New Roman"/>
+              </w:rPr>
+            </w:pPr>
+            <w:r>
+              <w:rPr>
+                <w:rFonts w:ascii="Times New Roman" w:eastAsia="Calibri" w:hAnsi="Times New Roman" w:cs="Times New Roman"/>
+              </w:rPr>
+              <w:t>{{TITULO_ATV9}}</w:t>
+            </w:r>
+          </w:p>
+        </w:tc>
+        <w:tc>
+          <w:tcPr>
+            <w:tcW w:w="2880" w:type="dxa"/>
+            <w:tcMar>
+              <w:top w:w="100" w:type="dxa"/>
+              <w:left w:w="100" w:type="dxa"/>
+              <w:bottom w:w="100" w:type="dxa"/>
+              <w:right w:w="100" w:type="dxa"/>
+            </w:tcMar>
+          </w:tcPr>
+          <w:p>
+            <w:pPr>
+              <w:spacing w:line="240" w:lineRule="auto"/>
+              <w:jc w:val="center"/>
+              <w:rPr>
+                <w:rFonts w:ascii="Times New Roman" w:eastAsia="Calibri" w:hAnsi="Times New Roman" w:cs="Times New Roman"/>
+              </w:rPr>
+            </w:pPr>
+            <w:r>
+              <w:rPr>
+                <w:rFonts w:ascii="Times New Roman" w:hAnsi="Times New Roman"/>
+                <w:sz w:val="24"/>
+              </w:rPr>
+              <w:t>{{CARGA_ATV9}}</w:t>
+            </w:r>
+          </w:p>
+        </w:tc>
+      </w:tr>
+      <w:tr>
+        <w:trPr>
+          <w:trHeight w:val="412"/>
+        </w:trPr>
+        <w:tc>
+          <w:tcPr>
+            <w:tcW w:w="576" w:type="dxa"/>
+            <w:tcMar>
+              <w:top w:w="100" w:type="dxa"/>
+              <w:left w:w="100" w:type="dxa"/>
+              <w:bottom w:w="100" w:type="dxa"/>
+              <w:right w:w="100" w:type="dxa"/>
+            </w:tcMar>
+          </w:tcPr>
+          <w:p>
+            <w:pPr>
+              <w:widowControl w:val="0"/>
+              <w:pBdr>
+                <w:top w:val="nil"/>
+                <w:left w:val="nil"/>
+                <w:bottom w:val="nil"/>
+                <w:right w:val="nil"/>
+                <w:between w:val="nil"/>
+              </w:pBdr>
+              <w:spacing w:line="240" w:lineRule="auto"/>
+              <w:jc w:val="center"/>
+              <w:rPr>
+                <w:rFonts w:ascii="Times New Roman" w:eastAsia="Calibri" w:hAnsi="Times New Roman" w:cs="Times New Roman"/>
+                <w:color w:val="000000"/>
+              </w:rPr>
+            </w:pPr>
+            <w:r>
+              <w:rPr>
+                <w:rFonts w:ascii="Times New Roman" w:eastAsia="Calibri" w:hAnsi="Times New Roman" w:cs="Times New Roman"/>
+              </w:rPr>
+              <w:t>10-</w:t>
+            </w:r>
+          </w:p>
+        </w:tc>
+        <w:tc>
+          <w:tcPr>
+            <w:tcW w:w="6744" w:type="dxa"/>
+            <w:tcMar>
+              <w:top w:w="100" w:type="dxa"/>
+              <w:left w:w="100" w:type="dxa"/>
+              <w:bottom w:w="100" w:type="dxa"/>
+              <w:right w:w="100" w:type="dxa"/>
+            </w:tcMar>
+          </w:tcPr>
+          <w:p>
+            <w:pPr>
+              <w:widowControl w:val="0"/>
+              <w:pBdr>
+                <w:top w:val="nil"/>
+                <w:left w:val="nil"/>
+                <w:bottom w:val="nil"/>
+                <w:right w:val="nil"/>
+                <w:between w:val="nil"/>
+              </w:pBdr>
+              <w:spacing w:line="240" w:lineRule="auto"/>
+              <w:ind w:left="62"/>
+              <w:jc w:val="center"/>
+              <w:rPr>
+                <w:rFonts w:ascii="Times New Roman" w:eastAsia="Calibri" w:hAnsi="Times New Roman" w:cs="Times New Roman"/>
+              </w:rPr>
+            </w:pPr>
+            <w:r>
+              <w:rPr>
+                <w:rFonts w:ascii="Times New Roman" w:eastAsia="Calibri" w:hAnsi="Times New Roman" w:cs="Times New Roman"/>
+              </w:rPr>
+              <w:t>{{TITULO_ATV10}}</w:t>
+            </w:r>
+          </w:p>
+        </w:tc>
+        <w:tc>
+          <w:tcPr>
+            <w:tcW w:w="2880" w:type="dxa"/>
+            <w:tcMar>
+              <w:top w:w="100" w:type="dxa"/>
+              <w:left w:w="100" w:type="dxa"/>
+              <w:bottom w:w="100" w:type="dxa"/>
+              <w:right w:w="100" w:type="dxa"/>
+            </w:tcMar>
+          </w:tcPr>
+          <w:p>
+            <w:pPr>
+              <w:spacing w:line="240" w:lineRule="auto"/>
+              <w:jc w:val="center"/>
+              <w:rPr>
+                <w:rFonts w:ascii="Times New Roman" w:eastAsia="Calibri" w:hAnsi="Times New Roman" w:cs="Times New Roman"/>
+              </w:rPr>
+            </w:pPr>
+            <w:r>
+              <w:rPr>
+                <w:rFonts w:ascii="Times New Roman" w:hAnsi="Times New Roman"/>
+                <w:sz w:val="24"/>
+              </w:rPr>
+              <w:t>{{CARGA_ATV10}}</w:t>
             </w:r>
           </w:p>
         </w:tc>
@@ -3874,16 +3490,6 @@
         </w:rPr>
         <w:t>{{NUMERO_CONSELHO_RT}}</w:t>
       </w:r>
-      <w:r>
-        <w:rPr>
-          <w:rFonts w:ascii="Times New Roman" w:eastAsia="Calibri" w:hAnsi="Times New Roman" w:cs="Times New Roman"/>
-        </w:rPr>
-      </w:r>
-      <w:r>
-        <w:rPr>
-          <w:rFonts w:ascii="Times New Roman" w:eastAsia="Calibri" w:hAnsi="Times New Roman" w:cs="Times New Roman"/>
-        </w:rPr>
-      </w:r>
     </w:p>
     <w:p>
       <w:pPr>
@@ -3977,35 +3583,7 @@
         <w:rPr>
           <w:rFonts w:ascii="Times New Roman" w:eastAsia="Calibri" w:hAnsi="Times New Roman" w:cs="Times New Roman"/>
         </w:rPr>
-        <w:t>{{DATA_</w:t>
-      </w:r>
-      <w:proofErr w:type="gramStart"/>
-      <w:r>
-        <w:rPr>
-          <w:rFonts w:ascii="Times New Roman" w:eastAsia="Calibri" w:hAnsi="Times New Roman" w:cs="Times New Roman"/>
-        </w:rPr>
-        <w:t>INICIO</w:t>
-      </w:r>
-      <w:proofErr w:type="gramEnd"/>
-      <w:r>
-        <w:rPr>
-          <w:rFonts w:ascii="Times New Roman" w:eastAsia="Calibri" w:hAnsi="Times New Roman" w:cs="Times New Roman"/>
-        </w:rPr>
-        <w:t>_</w:t>
-      </w:r>
-      <w:proofErr w:type="gramStart"/>
-      <w:r>
-        <w:rPr>
-          <w:rFonts w:ascii="Times New Roman" w:eastAsia="Calibri" w:hAnsi="Times New Roman" w:cs="Times New Roman"/>
-        </w:rPr>
-        <w:t>ESTAGIO</w:t>
-      </w:r>
-      <w:proofErr w:type="gramEnd"/>
-      <w:r>
-        <w:rPr>
-          <w:rFonts w:ascii="Times New Roman" w:eastAsia="Calibri" w:hAnsi="Times New Roman" w:cs="Times New Roman"/>
-        </w:rPr>
-        <w:t>}}</w:t>
+        <w:t>{{DATA_INICIO_ESTAGIO}}</w:t>
       </w:r>
     </w:p>
     <w:p>
@@ -4124,19 +3702,12 @@
           <w:rFonts w:ascii="Times New Roman" w:eastAsia="Calibri" w:hAnsi="Times New Roman" w:cs="Times New Roman"/>
           <w:color w:val="1F1F1F"/>
         </w:rPr>
-        <w:t xml:space="preserve"> </w:t>
-      </w:r>
-      <w:r>
-        <w:rPr>
-          <w:rFonts w:ascii="Times New Roman" w:eastAsia="Calibri" w:hAnsi="Times New Roman" w:cs="Times New Roman"/>
-          <w:color w:val="1F1F1F"/>
-        </w:rPr>
-        <w:t>{{RA_ALUNO}}</w:t>
+        <w:t xml:space="preserve"> {{RA_ALUNO}}</w:t>
       </w:r>
     </w:p>
     <w:sectPr>
-      <w:footerReference w:type="default" r:id="rId9"/>
-      <w:headerReference w:type="default" r:id="rId12"/>
+      <w:headerReference w:type="default" r:id="rId9"/>
+      <w:footerReference w:type="default" r:id="rId10"/>
       <w:pgSz w:w="11900" w:h="16840"/>
       <w:pgMar w:top="270" w:right="788" w:bottom="343" w:left="736" w:header="0" w:footer="57" w:gutter="0"/>
       <w:pgNumType w:start="1"/>
@@ -4263,12 +3834,8 @@
 </file>
 
 <file path=word/header1.xml><?xml version="1.0" encoding="utf-8"?>
-<w:hdr xmlns:m="http://schemas.openxmlformats.org/officeDocument/2006/math" xmlns:mc="http://schemas.openxmlformats.org/markup-compatibility/2006" xmlns:mo="http://schemas.microsoft.com/office/mac/office/2008/main" xmlns:mv="urn:schemas-microsoft-com:mac:vml" xmlns:o="urn:schemas-microsoft-com:office:office" xmlns:r="http://schemas.openxmlformats.org/officeDocument/2006/relationships" xmlns:v="urn:schemas-microsoft-com:vml" xmlns:w10="urn:schemas-microsoft-com:office:word" xmlns:w14="http://schemas.microsoft.com/office/word/2010/wordml" xmlns:w="http://schemas.openxmlformats.org/wordprocessingml/2006/main" xmlns:wne="http://schemas.microsoft.com/office/word/2006/wordml" xmlns:wp14="http://schemas.microsoft.com/office/word/2010/wordprocessingDrawing" xmlns:wp="http://schemas.openxmlformats.org/drawingml/2006/wordprocessingDrawing" xmlns:wpc="http://schemas.microsoft.com/office/word/2010/wordprocessingCanvas" xmlns:wpg="http://schemas.microsoft.com/office/word/2010/wordprocessingGroup" xmlns:wpi="http://schemas.microsoft.com/office/word/2010/wordprocessingInk" xmlns:wps="http://schemas.microsoft.com/office/word/2010/wordprocessingShape" mc:Ignorable="w14 wp14">
-  <w:p>
-    <w:pPr>
-      <w:pStyle w:val="Header"/>
-    </w:pPr>
-  </w:p>
+<w:hdr xmlns:wpc="http://schemas.microsoft.com/office/word/2010/wordprocessingCanvas" xmlns:cx="http://schemas.microsoft.com/office/drawing/2014/chartex" xmlns:cx1="http://schemas.microsoft.com/office/drawing/2015/9/8/chartex" xmlns:cx2="http://schemas.microsoft.com/office/drawing/2015/10/21/chartex" xmlns:cx3="http://schemas.microsoft.com/office/drawing/2016/5/9/chartex" xmlns:cx4="http://schemas.microsoft.com/office/drawing/2016/5/10/chartex" xmlns:cx5="http://schemas.microsoft.com/office/drawing/2016/5/11/chartex" xmlns:cx6="http://schemas.microsoft.com/office/drawing/2016/5/12/chartex" xmlns:cx7="http://schemas.microsoft.com/office/drawing/2016/5/13/chartex" xmlns:cx8="http://schemas.microsoft.com/office/drawing/2016/5/14/chartex" xmlns:mc="http://schemas.openxmlformats.org/markup-compatibility/2006" xmlns:aink="http://schemas.microsoft.com/office/drawing/2016/ink" xmlns:am3d="http://schemas.microsoft.com/office/drawing/2017/model3d" xmlns:o="urn:schemas-microsoft-com:office:office" xmlns:oel="http://schemas.microsoft.com/office/2019/extlst" xmlns:r="http://schemas.openxmlformats.org/officeDocument/2006/relationships" xmlns:m="http://schemas.openxmlformats.org/officeDocument/2006/math" xmlns:v="urn:schemas-microsoft-com:vml" xmlns:wp14="http://schemas.microsoft.com/office/word/2010/wordprocessingDrawing" xmlns:wp="http://schemas.openxmlformats.org/drawingml/2006/wordprocessingDrawing" xmlns:w10="urn:schemas-microsoft-com:office:word" xmlns:w="http://schemas.openxmlformats.org/wordprocessingml/2006/main" xmlns:w14="http://schemas.microsoft.com/office/word/2010/wordml" xmlns:w15="http://schemas.microsoft.com/office/word/2012/wordml" xmlns:w16cex="http://schemas.microsoft.com/office/word/2018/wordml/cex" xmlns:w16cid="http://schemas.microsoft.com/office/word/2016/wordml/cid" xmlns:w16="http://schemas.microsoft.com/office/word/2018/wordml" xmlns:w16du="http://schemas.microsoft.com/office/word/2023/wordml/word16du" xmlns:w16sdtdh="http://schemas.microsoft.com/office/word/2020/wordml/sdtdatahash" xmlns:w16sdtfl="http://schemas.microsoft.com/office/word/2024/wordml/sdtformatlock" xmlns:w16se="http://schemas.microsoft.com/office/word/2015/wordml/symex" xmlns:wpg="http://schemas.microsoft.com/office/word/2010/wordprocessingGroup" xmlns:wpi="http://schemas.microsoft.com/office/word/2010/wordprocessingInk" xmlns:wne="http://schemas.microsoft.com/office/word/2006/wordml" xmlns:wps="http://schemas.microsoft.com/office/word/2010/wordprocessingShape" mc:Ignorable="w14 w15 w16se w16cid w16 w16cex w16sdtdh w16sdtfl w16du wp14">
+  <w:p/>
 </w:hdr>
 </file>
 

</xml_diff>